<commit_message>
feat(fusion): v7.0 multi-modal fusion engine enhancements + benchmarks
Four major v7.0 capabilities:
- Vector embedding semantic matching (Gemini text-embedding-004, Tier 2.5)
- LLM-enhanced strategy routing (Gemini 2.0 Flash, strategy="llm_auto")
- Geographic knowledge graph (networkx DiGraph, 7 entity types, 5 relations)
- Distributed/chunked computing (dask + fiona, >500K rows auto-chunked)

Benchmark suite (9 metrics, all passing):
- Semantic matching: P=1.00, R=0.95, F1=0.98
- Strategy selection: 100% accuracy (30/30 scenarios)
- Unit conversion: zero error (8 conversion pairs)
- Compatibility scoring: 100% band accuracy
- Fusion quality: mean 0.96 ± 0.10 (8 strategies)
- Defect detection: 100% (7/7 defect types)
- Data preservation: row 1.00, geometry 1.00
- Coverage: 5/5 modalities, 10/10 strategies, 11/11 type pairs
- Performance: ~30K rows/s at 10K scale

Co-Authored-By: Claude Opus 4.6 <noreply@anthropic.com>
</commit_message>
<xml_diff>
--- a/docs/MMFE_技术文档.docx
+++ b/docs/MMFE_技术文档.docx
@@ -5033,7 +5033,7 @@
         <w:pStyle w:val="Heading3"/>
       </w:pPr>
       <w:r>
-        <w:t>5.1.3 缺乏真实数据效果评估（v6.0 部分改善）</w:t>
+        <w:t>5.1.3 缺乏真实数据效果评估</w:t>
       </w:r>
     </w:p>
     <w:p>
@@ -5065,7 +5065,7 @@
         <w:rPr>
           <w:b/>
         </w:rPr>
-        <w:t>v6.0 改善</w:t>
+        <w:t xml:space="preserve"> 改善</w:t>
       </w:r>
       <w:r>
         <w:t>：新增 `TestRealDataIntegration` 测试类（4个测试），使用 `evals/fixtures/sample_parcels.geojson`（10个真实地块要素，含DLBM/SLOPE/AREA/TBMJ字段）进行画像、质量验证、自融合、字段匹配的集成测试。但仍需更大规模的真实数据集和效果对比实验。</w:t>
@@ -5084,7 +5084,7 @@
         <w:pStyle w:val="Heading3"/>
       </w:pPr>
       <w:r>
-        <w:t>5.2.1 近期改进（v6.0）— 已完成</w:t>
+        <w:t>5.2.1 近期改进— 已完成</w:t>
       </w:r>
     </w:p>
     <w:tbl>
@@ -5670,7 +5670,12 @@
         <w:pStyle w:val="Heading2"/>
       </w:pPr>
       <w:r>
-        <w:t>6 相关工作</w:t>
+        <w:t>6 增强：智能化融合</w:t>
+      </w:r>
+    </w:p>
+    <w:p>
+      <w:r>
+        <w:t>在 基础上进一步增强了引擎的智能化水平，从四个维度提升融合引擎能力。</w:t>
       </w:r>
     </w:p>
     <w:p>
@@ -5678,7 +5683,2796 @@
         <w:pStyle w:val="Heading3"/>
       </w:pPr>
       <w:r>
-        <w:t>6.1 传统GIS数据融合方法</w:t>
+        <w:t>6.1 向量嵌入语义匹配</w:t>
+      </w:r>
+    </w:p>
+    <w:p>
+      <w:r>
+        <w:rPr>
+          <w:b/>
+        </w:rPr>
+        <w:t>动机</w:t>
+      </w:r>
+      <w:r>
+        <w:t>：现有四层匹配依赖硬编码的等价组和字符级模糊匹配，对于语义相近但拼写差异大的字段名（如 `population` vs `inhabitants`、`landuse_type` vs `DLBM`）匹配效果有限。</w:t>
+      </w:r>
+    </w:p>
+    <w:p>
+      <w:r>
+        <w:rPr>
+          <w:b/>
+        </w:rPr>
+        <w:t>方案</w:t>
+      </w:r>
+      <w:r>
+        <w:t xml:space="preserve">：在 Tier 2（等价组）和 Tier 3（单位感知）之间插入 </w:t>
+      </w:r>
+      <w:r>
+        <w:rPr>
+          <w:b/>
+        </w:rPr>
+        <w:t>Tier 2.5 嵌入层</w:t>
+      </w:r>
+      <w:r>
+        <w:t>，利用 Gemini `text-embedding-004` 模型将字段名映射到高维语义向量空间，通过余弦相似度计算语义距离。</w:t>
+      </w:r>
+    </w:p>
+    <w:p>
+      <w:r>
+        <w:rPr>
+          <w:b/>
+        </w:rPr>
+        <w:t>实现细节</w:t>
+      </w:r>
+      <w:r>
+        <w:t>：</w:t>
+      </w:r>
+    </w:p>
+    <w:p>
+      <w:pPr>
+        <w:pStyle w:val="ListBullet"/>
+      </w:pPr>
+      <w:r>
+        <w:t>使用 `google.genai.Client().models.embed_content()` 批量获取字段名嵌入向量</w:t>
+      </w:r>
+    </w:p>
+    <w:p>
+      <w:pPr>
+        <w:pStyle w:val="ListBullet"/>
+      </w:pPr>
+      <w:r>
+        <w:t>模块级 `_embedding_cache` 字典避免重复 API 调用</w:t>
+      </w:r>
+    </w:p>
+    <w:p>
+      <w:pPr>
+        <w:pStyle w:val="ListBullet"/>
+      </w:pPr>
+      <w:r>
+        <w:t>余弦相似度阈值 ≥ 0.75，匹配置信度 0.78</w:t>
+      </w:r>
+    </w:p>
+    <w:p>
+      <w:pPr>
+        <w:pStyle w:val="ListBullet"/>
+      </w:pPr>
+      <w:r>
+        <w:t>匹配前检查字段类型兼容性（numeric↔numeric、string↔string）</w:t>
+      </w:r>
+    </w:p>
+    <w:p>
+      <w:pPr>
+        <w:pStyle w:val="ListBullet"/>
+      </w:pPr>
+      <w:r>
+        <w:t>API 失败时静默降级到 Tier 3/4，不影响现有流程</w:t>
+      </w:r>
+    </w:p>
+    <w:p>
+      <w:pPr>
+        <w:pStyle w:val="ListBullet"/>
+      </w:pPr>
+      <w:r>
+        <w:t>**默认关闭**，通过 `use_embedding=True` 显式启用，避免不必要的 API 开销</w:t>
+      </w:r>
+    </w:p>
+    <w:p>
+      <w:r>
+        <w:rPr>
+          <w:b/>
+        </w:rPr>
+        <w:t>设计权衡</w:t>
+      </w:r>
+      <w:r>
+        <w:t>：选择 Gemini text-embedding-004 而非 sentence-transformers 的原因：</w:t>
+      </w:r>
+    </w:p>
+    <w:p>
+      <w:r>
+        <w:t>1. sentence-transformers 引入 ~400MB 依赖（torch + transformers），不适合轻量部署</w:t>
+      </w:r>
+    </w:p>
+    <w:p>
+      <w:r>
+        <w:t>2. 项目已依赖 google-genai，API 调用无额外安装成本</w:t>
+      </w:r>
+    </w:p>
+    <w:p>
+      <w:r>
+        <w:t>3. 嵌入缓存机制减少了 API 调用频率</w:t>
+      </w:r>
+    </w:p>
+    <w:p>
+      <w:pPr>
+        <w:pStyle w:val="Heading3"/>
+      </w:pPr>
+      <w:r>
+        <w:t>6.2 LLM 增强策略路由</w:t>
+      </w:r>
+    </w:p>
+    <w:p>
+      <w:r>
+        <w:rPr>
+          <w:b/>
+        </w:rPr>
+        <w:t>动机</w:t>
+      </w:r>
+      <w:r>
+        <w:t>：现有规则评分（IoU、几何类型、数据量比率）缺乏对用户分析意图的理解。例如，同一对数据源可能因"分析土地覆被变化"和"计算设施覆盖率"两种不同目的而需要不同的融合策略。</w:t>
+      </w:r>
+    </w:p>
+    <w:p>
+      <w:r>
+        <w:rPr>
+          <w:b/>
+        </w:rPr>
+        <w:t>方案</w:t>
+      </w:r>
+      <w:r>
+        <w:t>：新增 `strategy="llm_auto"` 选项，调用 Gemini 2.0 Flash 进行策略推理。LLM 接收候选策略列表、数据源元信息和用户意图提示（`user_hint`），返回 JSON 格式的策略推荐与推理链。</w:t>
+      </w:r>
+    </w:p>
+    <w:p>
+      <w:r>
+        <w:rPr>
+          <w:b/>
+        </w:rPr>
+        <w:t>实现细节</w:t>
+      </w:r>
+      <w:r>
+        <w:t>：</w:t>
+      </w:r>
+    </w:p>
+    <w:p>
+      <w:pPr>
+        <w:pStyle w:val="ListBullet"/>
+      </w:pPr>
+      <w:r>
+        <w:t>`_llm_select_strategy()` 构造结构化 prompt，包含：</w:t>
+      </w:r>
+    </w:p>
+    <w:p>
+      <w:r>
+        <w:t>- 候选策略列表（来自 STRATEGY_MATRIX 粗筛）</w:t>
+      </w:r>
+    </w:p>
+    <w:p>
+      <w:r>
+        <w:t>- 各数据源的类型、行数、列名</w:t>
+      </w:r>
+    </w:p>
+    <w:p>
+      <w:r>
+        <w:t>- 用户提供的分析意图描述</w:t>
+      </w:r>
+    </w:p>
+    <w:p>
+      <w:pPr>
+        <w:pStyle w:val="ListBullet"/>
+      </w:pPr>
+      <w:r>
+        <w:t>LLM 返回 `{"strategy": "spatial_join", "reasoning": "..."}`</w:t>
+      </w:r>
+    </w:p>
+    <w:p>
+      <w:pPr>
+        <w:pStyle w:val="ListBullet"/>
+      </w:pPr>
+      <w:r>
+        <w:t>策略验证：LLM 推荐的策略必须在候选列表内，否则降级到规则评分</w:t>
+      </w:r>
+    </w:p>
+    <w:p>
+      <w:pPr>
+        <w:pStyle w:val="ListBullet"/>
+      </w:pPr>
+      <w:r>
+        <w:t>JSON 解析失败时降级到规则评分</w:t>
+      </w:r>
+    </w:p>
+    <w:p>
+      <w:pPr>
+        <w:pStyle w:val="ListBullet"/>
+      </w:pPr>
+      <w:r>
+        <w:t>推理结果记录到 `alignment_log` 中，供审计追踪</w:t>
+      </w:r>
+    </w:p>
+    <w:p>
+      <w:pPr>
+        <w:pStyle w:val="ListBullet"/>
+      </w:pPr>
+      <w:r>
+        <w:t>**非替代**：规则评分仍然是默认行为，LLM 仅在显式请求时介入</w:t>
+      </w:r>
+    </w:p>
+    <w:p>
+      <w:pPr>
+        <w:pStyle w:val="Heading3"/>
+      </w:pPr>
+      <w:r>
+        <w:t>6.3 地理知识图谱</w:t>
+      </w:r>
+    </w:p>
+    <w:p>
+      <w:r>
+        <w:rPr>
+          <w:b/>
+        </w:rPr>
+        <w:t>动机</w:t>
+      </w:r>
+      <w:r>
+        <w:t>：传统融合引擎输出"宽表"（列合并），丢失了实体间的空间关系。例如，一个地块被道路分割为两部分，或一栋建筑包含在一个行政区内——这些关系在宽表中无法表达。</w:t>
+      </w:r>
+    </w:p>
+    <w:p>
+      <w:r>
+        <w:rPr>
+          <w:b/>
+        </w:rPr>
+        <w:t>方案</w:t>
+      </w:r>
+      <w:r>
+        <w:t>：新建独立模块 `knowledge_graph.py`，使用 networkx 有向图 (DiGraph) 构建内存级空间实体关系图。支持 7 种实体类型（地块、建筑、道路、水体、行政区、植被、POI）和 5 种关系类型（包含、被包含、邻接、重叠、最近）。</w:t>
+      </w:r>
+    </w:p>
+    <w:p>
+      <w:r>
+        <w:rPr>
+          <w:b/>
+        </w:rPr>
+        <w:t>核心类</w:t>
+      </w:r>
+      <w:r>
+        <w:t>：`GeoKnowledgeGraph`</w:t>
+      </w:r>
+    </w:p>
+    <w:p>
+      <w:pPr>
+        <w:pStyle w:val="ListBullet"/>
+      </w:pPr>
+      <w:r>
+        <w:t>`build_from_geodataframe()`：GeoDataFrame 行 → 图节点，自动推断实体类型</w:t>
+      </w:r>
+    </w:p>
+    <w:p>
+      <w:pPr>
+        <w:pStyle w:val="ListBullet"/>
+      </w:pPr>
+      <w:r>
+        <w:t>`merge_layer()`：增量添加图层，检测跨层空间关系</w:t>
+      </w:r>
+    </w:p>
+    <w:p>
+      <w:pPr>
+        <w:pStyle w:val="ListBullet"/>
+      </w:pPr>
+      <w:r>
+        <w:t>`query_neighbors(depth=N)`：N 跳邻居查询</w:t>
+      </w:r>
+    </w:p>
+    <w:p>
+      <w:pPr>
+        <w:pStyle w:val="ListBullet"/>
+      </w:pPr>
+      <w:r>
+        <w:t>`query_path(source, target)`：最短路径查询</w:t>
+      </w:r>
+    </w:p>
+    <w:p>
+      <w:pPr>
+        <w:pStyle w:val="ListBullet"/>
+      </w:pPr>
+      <w:r>
+        <w:t>`query_by_type(entity_type)`：按实体类型筛选</w:t>
+      </w:r>
+    </w:p>
+    <w:p>
+      <w:pPr>
+        <w:pStyle w:val="ListBullet"/>
+      </w:pPr>
+      <w:r>
+        <w:t>`export_to_json()`：`nx.node_link_data()` 标准格式导出</w:t>
+      </w:r>
+    </w:p>
+    <w:p>
+      <w:pPr>
+        <w:pStyle w:val="ListBullet"/>
+      </w:pPr>
+      <w:r>
+        <w:t>`_detect_adjacency()`：STRtree 空间索引加速邻接关系检测</w:t>
+      </w:r>
+    </w:p>
+    <w:p>
+      <w:pPr>
+        <w:pStyle w:val="ListBullet"/>
+      </w:pPr>
+      <w:r>
+        <w:t>`_detect_containment()`：contains/within 几何关系检测</w:t>
+      </w:r>
+    </w:p>
+    <w:p>
+      <w:r>
+        <w:rPr>
+          <w:b/>
+        </w:rPr>
+        <w:t>性能保护</w:t>
+      </w:r>
+      <w:r>
+        <w:t>：`_MAX_SPATIAL_PAIRS = 1000`，避免大数据集的 O(n²) 组合爆炸。</w:t>
+      </w:r>
+    </w:p>
+    <w:p>
+      <w:pPr>
+        <w:pStyle w:val="Heading3"/>
+      </w:pPr>
+      <w:r>
+        <w:t>6.4 分布式/核外计算</w:t>
+      </w:r>
+    </w:p>
+    <w:p>
+      <w:r>
+        <w:rPr>
+          <w:b/>
+        </w:rPr>
+        <w:t>动机</w:t>
+      </w:r>
+      <w:r>
+        <w:t>：大数据集（&gt;50万行或 &gt;500MB）在内存中完整加载会导致 OOM。</w:t>
+      </w:r>
+    </w:p>
+    <w:p>
+      <w:r>
+        <w:rPr>
+          <w:b/>
+        </w:rPr>
+        <w:t>方案</w:t>
+      </w:r>
+      <w:r>
+        <w:t>：利用项目已有的 dask 和 fiona 库，实现透明的分块读取和处理。</w:t>
+      </w:r>
+    </w:p>
+    <w:p>
+      <w:r>
+        <w:rPr>
+          <w:b/>
+        </w:rPr>
+        <w:t>实现细节</w:t>
+      </w:r>
+      <w:r>
+        <w:t>：</w:t>
+      </w:r>
+    </w:p>
+    <w:p>
+      <w:pPr>
+        <w:pStyle w:val="ListBullet"/>
+      </w:pPr>
+      <w:r>
+        <w:t>`_is_large_dataset(path, row_hint)`：通过文件大小（500MB）和行数（500K）双重阈值检测</w:t>
+      </w:r>
+    </w:p>
+    <w:p>
+      <w:pPr>
+        <w:pStyle w:val="ListBullet"/>
+      </w:pPr>
+      <w:r>
+        <w:t>`_read_vector_chunked(path, chunk_size=100K)`：fiona 分块读取矢量文件</w:t>
+      </w:r>
+    </w:p>
+    <w:p>
+      <w:pPr>
+        <w:pStyle w:val="ListBullet"/>
+      </w:pPr>
+      <w:r>
+        <w:t>`_read_tabular_lazy(path)`：dask.dataframe 延迟计算大 CSV 文件</w:t>
+      </w:r>
+    </w:p>
+    <w:p>
+      <w:pPr>
+        <w:pStyle w:val="ListBullet"/>
+      </w:pPr>
+      <w:r>
+        <w:t>`_fuse_large_datasets_spatial(gdf_left, gdf_right, chunk_size=50K)`：分块执行 spatial_join</w:t>
+      </w:r>
+    </w:p>
+    <w:p>
+      <w:pPr>
+        <w:pStyle w:val="ListBullet"/>
+      </w:pPr>
+      <w:r>
+        <w:t>**透明性**：修改 `_profile_vector()`、`_profile_tabular()`、`align_sources()`、`_strategy_spatial_join()` 使用新的读取函数，对调用方无感知</w:t>
+      </w:r>
+    </w:p>
+    <w:p>
+      <w:pPr>
+        <w:pStyle w:val="ListBullet"/>
+      </w:pPr>
+      <w:r>
+        <w:t>小文件行为完全不变，仅大文件自动切换到分块模式</w:t>
+      </w:r>
+    </w:p>
+    <w:p>
+      <w:pPr>
+        <w:pStyle w:val="Heading2"/>
+      </w:pPr>
+      <w:r>
+        <w:t>6.5 实验评估与量化指标</w:t>
+      </w:r>
+    </w:p>
+    <w:p>
+      <w:r>
+        <w:t>为系统性验证 MMFE 各模块的能力，我们设计了包含 9 项核心指标的基准测试套件（`benchmark_fusion.py`），在合成数据上运行真实引擎函数，产出可量化的技术指标。</w:t>
+      </w:r>
+    </w:p>
+    <w:p>
+      <w:pPr>
+        <w:pStyle w:val="Heading3"/>
+      </w:pPr>
+      <w:r>
+        <w:t>6.5.1 语义匹配准确率</w:t>
+      </w:r>
+    </w:p>
+    <w:p>
+      <w:r>
+        <w:t>基于 50 对字段名 ground truth（含精确匹配、等价组、单位感知、模糊匹配及负例），测量 `_find_field_matches()` 的精确率/召回率/F1：</w:t>
+      </w:r>
+    </w:p>
+    <w:tbl>
+      <w:tblPr>
+        <w:tblStyle w:val="TableGrid"/>
+        <w:tblW w:type="auto" w:w="0"/>
+        <w:jc w:val="center"/>
+        <w:tblLook w:firstColumn="1" w:firstRow="1" w:lastColumn="0" w:lastRow="0" w:noHBand="0" w:noVBand="1" w:val="04A0"/>
+      </w:tblPr>
+      <w:tblGrid>
+        <w:gridCol w:w="1662"/>
+        <w:gridCol w:w="1662"/>
+        <w:gridCol w:w="1662"/>
+        <w:gridCol w:w="1662"/>
+        <w:gridCol w:w="1662"/>
+      </w:tblGrid>
+      <w:tr>
+        <w:tc>
+          <w:tcPr>
+            <w:tcW w:type="dxa" w:w="1662"/>
+          </w:tcPr>
+          <w:p>
+            <w:r/>
+            <w:r>
+              <w:rPr>
+                <w:rFonts w:ascii="Times New Roman" w:hAnsi="Times New Roman"/>
+                <w:b/>
+                <w:sz w:val="18"/>
+              </w:rPr>
+              <w:t>匹配层级</w:t>
+            </w:r>
+          </w:p>
+        </w:tc>
+        <w:tc>
+          <w:tcPr>
+            <w:tcW w:type="dxa" w:w="1662"/>
+          </w:tcPr>
+          <w:p>
+            <w:r/>
+            <w:r>
+              <w:rPr>
+                <w:rFonts w:ascii="Times New Roman" w:hAnsi="Times New Roman"/>
+                <w:b/>
+                <w:sz w:val="18"/>
+              </w:rPr>
+              <w:t>测试对数</w:t>
+            </w:r>
+          </w:p>
+        </w:tc>
+        <w:tc>
+          <w:tcPr>
+            <w:tcW w:type="dxa" w:w="1662"/>
+          </w:tcPr>
+          <w:p>
+            <w:r/>
+            <w:r>
+              <w:rPr>
+                <w:rFonts w:ascii="Times New Roman" w:hAnsi="Times New Roman"/>
+                <w:b/>
+                <w:sz w:val="18"/>
+              </w:rPr>
+              <w:t>Precision</w:t>
+            </w:r>
+          </w:p>
+        </w:tc>
+        <w:tc>
+          <w:tcPr>
+            <w:tcW w:type="dxa" w:w="1662"/>
+          </w:tcPr>
+          <w:p>
+            <w:r/>
+            <w:r>
+              <w:rPr>
+                <w:rFonts w:ascii="Times New Roman" w:hAnsi="Times New Roman"/>
+                <w:b/>
+                <w:sz w:val="18"/>
+              </w:rPr>
+              <w:t>Recall</w:t>
+            </w:r>
+          </w:p>
+        </w:tc>
+        <w:tc>
+          <w:tcPr>
+            <w:tcW w:type="dxa" w:w="1662"/>
+          </w:tcPr>
+          <w:p>
+            <w:r/>
+            <w:r>
+              <w:rPr>
+                <w:rFonts w:ascii="Times New Roman" w:hAnsi="Times New Roman"/>
+                <w:b/>
+                <w:sz w:val="18"/>
+              </w:rPr>
+              <w:t>F1</w:t>
+            </w:r>
+          </w:p>
+        </w:tc>
+      </w:tr>
+      <w:tr>
+        <w:tc>
+          <w:tcPr>
+            <w:tcW w:type="dxa" w:w="1662"/>
+          </w:tcPr>
+          <w:p>
+            <w:r/>
+            <w:r>
+              <w:rPr>
+                <w:rFonts w:ascii="Times New Roman" w:hAnsi="Times New Roman"/>
+                <w:sz w:val="18"/>
+              </w:rPr>
+              <w:t>Tier 1 精确匹配</w:t>
+            </w:r>
+          </w:p>
+        </w:tc>
+        <w:tc>
+          <w:tcPr>
+            <w:tcW w:type="dxa" w:w="1662"/>
+          </w:tcPr>
+          <w:p>
+            <w:r/>
+            <w:r>
+              <w:rPr>
+                <w:rFonts w:ascii="Times New Roman" w:hAnsi="Times New Roman"/>
+                <w:sz w:val="18"/>
+              </w:rPr>
+              <w:t>8</w:t>
+            </w:r>
+          </w:p>
+        </w:tc>
+        <w:tc>
+          <w:tcPr>
+            <w:tcW w:type="dxa" w:w="1662"/>
+          </w:tcPr>
+          <w:p>
+            <w:r/>
+            <w:r>
+              <w:rPr>
+                <w:rFonts w:ascii="Times New Roman" w:hAnsi="Times New Roman"/>
+                <w:sz w:val="18"/>
+              </w:rPr>
+              <w:t>1.00</w:t>
+            </w:r>
+          </w:p>
+        </w:tc>
+        <w:tc>
+          <w:tcPr>
+            <w:tcW w:type="dxa" w:w="1662"/>
+          </w:tcPr>
+          <w:p>
+            <w:r/>
+            <w:r>
+              <w:rPr>
+                <w:rFonts w:ascii="Times New Roman" w:hAnsi="Times New Roman"/>
+                <w:sz w:val="18"/>
+              </w:rPr>
+              <w:t>1.00</w:t>
+            </w:r>
+          </w:p>
+        </w:tc>
+        <w:tc>
+          <w:tcPr>
+            <w:tcW w:type="dxa" w:w="1662"/>
+          </w:tcPr>
+          <w:p>
+            <w:r/>
+            <w:r>
+              <w:rPr>
+                <w:rFonts w:ascii="Times New Roman" w:hAnsi="Times New Roman"/>
+                <w:sz w:val="18"/>
+              </w:rPr>
+              <w:t>1.00</w:t>
+            </w:r>
+          </w:p>
+        </w:tc>
+      </w:tr>
+      <w:tr>
+        <w:tc>
+          <w:tcPr>
+            <w:tcW w:type="dxa" w:w="1662"/>
+          </w:tcPr>
+          <w:p>
+            <w:r/>
+            <w:r>
+              <w:rPr>
+                <w:rFonts w:ascii="Times New Roman" w:hAnsi="Times New Roman"/>
+                <w:sz w:val="18"/>
+              </w:rPr>
+              <w:t>Tier 2 等价组</w:t>
+            </w:r>
+          </w:p>
+        </w:tc>
+        <w:tc>
+          <w:tcPr>
+            <w:tcW w:type="dxa" w:w="1662"/>
+          </w:tcPr>
+          <w:p>
+            <w:r/>
+            <w:r>
+              <w:rPr>
+                <w:rFonts w:ascii="Times New Roman" w:hAnsi="Times New Roman"/>
+                <w:sz w:val="18"/>
+              </w:rPr>
+              <w:t>12</w:t>
+            </w:r>
+          </w:p>
+        </w:tc>
+        <w:tc>
+          <w:tcPr>
+            <w:tcW w:type="dxa" w:w="1662"/>
+          </w:tcPr>
+          <w:p>
+            <w:r/>
+            <w:r>
+              <w:rPr>
+                <w:rFonts w:ascii="Times New Roman" w:hAnsi="Times New Roman"/>
+                <w:sz w:val="18"/>
+              </w:rPr>
+              <w:t>1.00</w:t>
+            </w:r>
+          </w:p>
+        </w:tc>
+        <w:tc>
+          <w:tcPr>
+            <w:tcW w:type="dxa" w:w="1662"/>
+          </w:tcPr>
+          <w:p>
+            <w:r/>
+            <w:r>
+              <w:rPr>
+                <w:rFonts w:ascii="Times New Roman" w:hAnsi="Times New Roman"/>
+                <w:sz w:val="18"/>
+              </w:rPr>
+              <w:t>1.00</w:t>
+            </w:r>
+          </w:p>
+        </w:tc>
+        <w:tc>
+          <w:tcPr>
+            <w:tcW w:type="dxa" w:w="1662"/>
+          </w:tcPr>
+          <w:p>
+            <w:r/>
+            <w:r>
+              <w:rPr>
+                <w:rFonts w:ascii="Times New Roman" w:hAnsi="Times New Roman"/>
+                <w:sz w:val="18"/>
+              </w:rPr>
+              <w:t>1.00</w:t>
+            </w:r>
+          </w:p>
+        </w:tc>
+      </w:tr>
+      <w:tr>
+        <w:tc>
+          <w:tcPr>
+            <w:tcW w:type="dxa" w:w="1662"/>
+          </w:tcPr>
+          <w:p>
+            <w:r/>
+            <w:r>
+              <w:rPr>
+                <w:rFonts w:ascii="Times New Roman" w:hAnsi="Times New Roman"/>
+                <w:sz w:val="18"/>
+              </w:rPr>
+              <w:t>Tier 3 单位感知</w:t>
+            </w:r>
+          </w:p>
+        </w:tc>
+        <w:tc>
+          <w:tcPr>
+            <w:tcW w:type="dxa" w:w="1662"/>
+          </w:tcPr>
+          <w:p>
+            <w:r/>
+            <w:r>
+              <w:rPr>
+                <w:rFonts w:ascii="Times New Roman" w:hAnsi="Times New Roman"/>
+                <w:sz w:val="18"/>
+              </w:rPr>
+              <w:t>10</w:t>
+            </w:r>
+          </w:p>
+        </w:tc>
+        <w:tc>
+          <w:tcPr>
+            <w:tcW w:type="dxa" w:w="1662"/>
+          </w:tcPr>
+          <w:p>
+            <w:r/>
+            <w:r>
+              <w:rPr>
+                <w:rFonts w:ascii="Times New Roman" w:hAnsi="Times New Roman"/>
+                <w:sz w:val="18"/>
+              </w:rPr>
+              <w:t>1.00</w:t>
+            </w:r>
+          </w:p>
+        </w:tc>
+        <w:tc>
+          <w:tcPr>
+            <w:tcW w:type="dxa" w:w="1662"/>
+          </w:tcPr>
+          <w:p>
+            <w:r/>
+            <w:r>
+              <w:rPr>
+                <w:rFonts w:ascii="Times New Roman" w:hAnsi="Times New Roman"/>
+                <w:sz w:val="18"/>
+              </w:rPr>
+              <w:t>0.80</w:t>
+            </w:r>
+          </w:p>
+        </w:tc>
+        <w:tc>
+          <w:tcPr>
+            <w:tcW w:type="dxa" w:w="1662"/>
+          </w:tcPr>
+          <w:p>
+            <w:r/>
+            <w:r>
+              <w:rPr>
+                <w:rFonts w:ascii="Times New Roman" w:hAnsi="Times New Roman"/>
+                <w:sz w:val="18"/>
+              </w:rPr>
+              <w:t>0.89</w:t>
+            </w:r>
+          </w:p>
+        </w:tc>
+      </w:tr>
+      <w:tr>
+        <w:tc>
+          <w:tcPr>
+            <w:tcW w:type="dxa" w:w="1662"/>
+          </w:tcPr>
+          <w:p>
+            <w:r/>
+            <w:r>
+              <w:rPr>
+                <w:rFonts w:ascii="Times New Roman" w:hAnsi="Times New Roman"/>
+                <w:sz w:val="18"/>
+              </w:rPr>
+              <w:t>Tier 4 模糊匹配</w:t>
+            </w:r>
+          </w:p>
+        </w:tc>
+        <w:tc>
+          <w:tcPr>
+            <w:tcW w:type="dxa" w:w="1662"/>
+          </w:tcPr>
+          <w:p>
+            <w:r/>
+            <w:r>
+              <w:rPr>
+                <w:rFonts w:ascii="Times New Roman" w:hAnsi="Times New Roman"/>
+                <w:sz w:val="18"/>
+              </w:rPr>
+              <w:t>12</w:t>
+            </w:r>
+          </w:p>
+        </w:tc>
+        <w:tc>
+          <w:tcPr>
+            <w:tcW w:type="dxa" w:w="1662"/>
+          </w:tcPr>
+          <w:p>
+            <w:r/>
+            <w:r>
+              <w:rPr>
+                <w:rFonts w:ascii="Times New Roman" w:hAnsi="Times New Roman"/>
+                <w:sz w:val="18"/>
+              </w:rPr>
+              <w:t>1.00</w:t>
+            </w:r>
+          </w:p>
+        </w:tc>
+        <w:tc>
+          <w:tcPr>
+            <w:tcW w:type="dxa" w:w="1662"/>
+          </w:tcPr>
+          <w:p>
+            <w:r/>
+            <w:r>
+              <w:rPr>
+                <w:rFonts w:ascii="Times New Roman" w:hAnsi="Times New Roman"/>
+                <w:sz w:val="18"/>
+              </w:rPr>
+              <w:t>1.00</w:t>
+            </w:r>
+          </w:p>
+        </w:tc>
+        <w:tc>
+          <w:tcPr>
+            <w:tcW w:type="dxa" w:w="1662"/>
+          </w:tcPr>
+          <w:p>
+            <w:r/>
+            <w:r>
+              <w:rPr>
+                <w:rFonts w:ascii="Times New Roman" w:hAnsi="Times New Roman"/>
+                <w:sz w:val="18"/>
+              </w:rPr>
+              <w:t>1.00</w:t>
+            </w:r>
+          </w:p>
+        </w:tc>
+      </w:tr>
+      <w:tr>
+        <w:tc>
+          <w:tcPr>
+            <w:tcW w:type="dxa" w:w="1662"/>
+          </w:tcPr>
+          <w:p>
+            <w:r/>
+            <w:r>
+              <w:rPr>
+                <w:rFonts w:ascii="Times New Roman" w:hAnsi="Times New Roman"/>
+                <w:sz w:val="18"/>
+              </w:rPr>
+              <w:t>负例（不应匹配）</w:t>
+            </w:r>
+          </w:p>
+        </w:tc>
+        <w:tc>
+          <w:tcPr>
+            <w:tcW w:type="dxa" w:w="1662"/>
+          </w:tcPr>
+          <w:p>
+            <w:r/>
+            <w:r>
+              <w:rPr>
+                <w:rFonts w:ascii="Times New Roman" w:hAnsi="Times New Roman"/>
+                <w:sz w:val="18"/>
+              </w:rPr>
+              <w:t>8</w:t>
+            </w:r>
+          </w:p>
+        </w:tc>
+        <w:tc>
+          <w:tcPr>
+            <w:tcW w:type="dxa" w:w="1662"/>
+          </w:tcPr>
+          <w:p>
+            <w:r/>
+            <w:r>
+              <w:rPr>
+                <w:rFonts w:ascii="Times New Roman" w:hAnsi="Times New Roman"/>
+                <w:sz w:val="18"/>
+              </w:rPr>
+              <w:t>1.00</w:t>
+            </w:r>
+          </w:p>
+        </w:tc>
+        <w:tc>
+          <w:tcPr>
+            <w:tcW w:type="dxa" w:w="1662"/>
+          </w:tcPr>
+          <w:p>
+            <w:r/>
+            <w:r>
+              <w:rPr>
+                <w:rFonts w:ascii="Times New Roman" w:hAnsi="Times New Roman"/>
+                <w:sz w:val="18"/>
+              </w:rPr>
+              <w:t>—</w:t>
+            </w:r>
+          </w:p>
+        </w:tc>
+        <w:tc>
+          <w:tcPr>
+            <w:tcW w:type="dxa" w:w="1662"/>
+          </w:tcPr>
+          <w:p>
+            <w:r/>
+            <w:r>
+              <w:rPr>
+                <w:rFonts w:ascii="Times New Roman" w:hAnsi="Times New Roman"/>
+                <w:sz w:val="18"/>
+              </w:rPr>
+              <w:t>—</w:t>
+            </w:r>
+          </w:p>
+        </w:tc>
+      </w:tr>
+      <w:tr>
+        <w:tc>
+          <w:tcPr>
+            <w:tcW w:type="dxa" w:w="1662"/>
+          </w:tcPr>
+          <w:p>
+            <w:r/>
+            <w:r>
+              <w:rPr>
+                <w:rFonts w:ascii="Times New Roman" w:hAnsi="Times New Roman"/>
+                <w:sz w:val="18"/>
+              </w:rPr>
+              <w:t>**总体**</w:t>
+            </w:r>
+          </w:p>
+        </w:tc>
+        <w:tc>
+          <w:tcPr>
+            <w:tcW w:type="dxa" w:w="1662"/>
+          </w:tcPr>
+          <w:p>
+            <w:r/>
+            <w:r>
+              <w:rPr>
+                <w:rFonts w:ascii="Times New Roman" w:hAnsi="Times New Roman"/>
+                <w:sz w:val="18"/>
+              </w:rPr>
+              <w:t>**50**</w:t>
+            </w:r>
+          </w:p>
+        </w:tc>
+        <w:tc>
+          <w:tcPr>
+            <w:tcW w:type="dxa" w:w="1662"/>
+          </w:tcPr>
+          <w:p>
+            <w:r/>
+            <w:r>
+              <w:rPr>
+                <w:rFonts w:ascii="Times New Roman" w:hAnsi="Times New Roman"/>
+                <w:sz w:val="18"/>
+              </w:rPr>
+              <w:t>**1.00**</w:t>
+            </w:r>
+          </w:p>
+        </w:tc>
+        <w:tc>
+          <w:tcPr>
+            <w:tcW w:type="dxa" w:w="1662"/>
+          </w:tcPr>
+          <w:p>
+            <w:r/>
+            <w:r>
+              <w:rPr>
+                <w:rFonts w:ascii="Times New Roman" w:hAnsi="Times New Roman"/>
+                <w:sz w:val="18"/>
+              </w:rPr>
+              <w:t>**0.95**</w:t>
+            </w:r>
+          </w:p>
+        </w:tc>
+        <w:tc>
+          <w:tcPr>
+            <w:tcW w:type="dxa" w:w="1662"/>
+          </w:tcPr>
+          <w:p>
+            <w:r/>
+            <w:r>
+              <w:rPr>
+                <w:rFonts w:ascii="Times New Roman" w:hAnsi="Times New Roman"/>
+                <w:sz w:val="18"/>
+              </w:rPr>
+              <w:t>**0.98**</w:t>
+            </w:r>
+          </w:p>
+        </w:tc>
+      </w:tr>
+    </w:tbl>
+    <w:p>
+      <w:pPr>
+        <w:pStyle w:val="Heading3"/>
+      </w:pPr>
+      <w:r>
+        <w:t>6.5.2 策略推荐准确率</w:t>
+      </w:r>
+    </w:p>
+    <w:p>
+      <w:r>
+        <w:t>构造 30 个数据对场景（覆盖矢量×矢量、矢量×栅格、矢量×表格、栅格×栅格、跨模态特殊），验证 `_auto_select_strategy()` 的推荐准确率：</w:t>
+      </w:r>
+    </w:p>
+    <w:tbl>
+      <w:tblPr>
+        <w:tblStyle w:val="TableGrid"/>
+        <w:tblW w:type="auto" w:w="0"/>
+        <w:jc w:val="center"/>
+        <w:tblLook w:firstColumn="1" w:firstRow="1" w:lastColumn="0" w:lastRow="0" w:noHBand="0" w:noVBand="1" w:val="04A0"/>
+      </w:tblPr>
+      <w:tblGrid>
+        <w:gridCol w:w="2771"/>
+        <w:gridCol w:w="2771"/>
+        <w:gridCol w:w="2771"/>
+      </w:tblGrid>
+      <w:tr>
+        <w:tc>
+          <w:tcPr>
+            <w:tcW w:type="dxa" w:w="2771"/>
+          </w:tcPr>
+          <w:p>
+            <w:r/>
+            <w:r>
+              <w:rPr>
+                <w:rFonts w:ascii="Times New Roman" w:hAnsi="Times New Roman"/>
+                <w:b/>
+                <w:sz w:val="18"/>
+              </w:rPr>
+              <w:t>场景类别</w:t>
+            </w:r>
+          </w:p>
+        </w:tc>
+        <w:tc>
+          <w:tcPr>
+            <w:tcW w:type="dxa" w:w="2771"/>
+          </w:tcPr>
+          <w:p>
+            <w:r/>
+            <w:r>
+              <w:rPr>
+                <w:rFonts w:ascii="Times New Roman" w:hAnsi="Times New Roman"/>
+                <w:b/>
+                <w:sz w:val="18"/>
+              </w:rPr>
+              <w:t>数量</w:t>
+            </w:r>
+          </w:p>
+        </w:tc>
+        <w:tc>
+          <w:tcPr>
+            <w:tcW w:type="dxa" w:w="2771"/>
+          </w:tcPr>
+          <w:p>
+            <w:r/>
+            <w:r>
+              <w:rPr>
+                <w:rFonts w:ascii="Times New Roman" w:hAnsi="Times New Roman"/>
+                <w:b/>
+                <w:sz w:val="18"/>
+              </w:rPr>
+              <w:t>准确率</w:t>
+            </w:r>
+          </w:p>
+        </w:tc>
+      </w:tr>
+      <w:tr>
+        <w:tc>
+          <w:tcPr>
+            <w:tcW w:type="dxa" w:w="2771"/>
+          </w:tcPr>
+          <w:p>
+            <w:r/>
+            <w:r>
+              <w:rPr>
+                <w:rFonts w:ascii="Times New Roman" w:hAnsi="Times New Roman"/>
+                <w:sz w:val="18"/>
+              </w:rPr>
+              <w:t>vector × vector</w:t>
+            </w:r>
+          </w:p>
+        </w:tc>
+        <w:tc>
+          <w:tcPr>
+            <w:tcW w:type="dxa" w:w="2771"/>
+          </w:tcPr>
+          <w:p>
+            <w:r/>
+            <w:r>
+              <w:rPr>
+                <w:rFonts w:ascii="Times New Roman" w:hAnsi="Times New Roman"/>
+                <w:sz w:val="18"/>
+              </w:rPr>
+              <w:t>10</w:t>
+            </w:r>
+          </w:p>
+        </w:tc>
+        <w:tc>
+          <w:tcPr>
+            <w:tcW w:type="dxa" w:w="2771"/>
+          </w:tcPr>
+          <w:p>
+            <w:r/>
+            <w:r>
+              <w:rPr>
+                <w:rFonts w:ascii="Times New Roman" w:hAnsi="Times New Roman"/>
+                <w:sz w:val="18"/>
+              </w:rPr>
+              <w:t>100%</w:t>
+            </w:r>
+          </w:p>
+        </w:tc>
+      </w:tr>
+      <w:tr>
+        <w:tc>
+          <w:tcPr>
+            <w:tcW w:type="dxa" w:w="2771"/>
+          </w:tcPr>
+          <w:p>
+            <w:r/>
+            <w:r>
+              <w:rPr>
+                <w:rFonts w:ascii="Times New Roman" w:hAnsi="Times New Roman"/>
+                <w:sz w:val="18"/>
+              </w:rPr>
+              <w:t>vector × raster</w:t>
+            </w:r>
+          </w:p>
+        </w:tc>
+        <w:tc>
+          <w:tcPr>
+            <w:tcW w:type="dxa" w:w="2771"/>
+          </w:tcPr>
+          <w:p>
+            <w:r/>
+            <w:r>
+              <w:rPr>
+                <w:rFonts w:ascii="Times New Roman" w:hAnsi="Times New Roman"/>
+                <w:sz w:val="18"/>
+              </w:rPr>
+              <w:t>8</w:t>
+            </w:r>
+          </w:p>
+        </w:tc>
+        <w:tc>
+          <w:tcPr>
+            <w:tcW w:type="dxa" w:w="2771"/>
+          </w:tcPr>
+          <w:p>
+            <w:r/>
+            <w:r>
+              <w:rPr>
+                <w:rFonts w:ascii="Times New Roman" w:hAnsi="Times New Roman"/>
+                <w:sz w:val="18"/>
+              </w:rPr>
+              <w:t>100%</w:t>
+            </w:r>
+          </w:p>
+        </w:tc>
+      </w:tr>
+      <w:tr>
+        <w:tc>
+          <w:tcPr>
+            <w:tcW w:type="dxa" w:w="2771"/>
+          </w:tcPr>
+          <w:p>
+            <w:r/>
+            <w:r>
+              <w:rPr>
+                <w:rFonts w:ascii="Times New Roman" w:hAnsi="Times New Roman"/>
+                <w:sz w:val="18"/>
+              </w:rPr>
+              <w:t>vector × tabular</w:t>
+            </w:r>
+          </w:p>
+        </w:tc>
+        <w:tc>
+          <w:tcPr>
+            <w:tcW w:type="dxa" w:w="2771"/>
+          </w:tcPr>
+          <w:p>
+            <w:r/>
+            <w:r>
+              <w:rPr>
+                <w:rFonts w:ascii="Times New Roman" w:hAnsi="Times New Roman"/>
+                <w:sz w:val="18"/>
+              </w:rPr>
+              <w:t>6</w:t>
+            </w:r>
+          </w:p>
+        </w:tc>
+        <w:tc>
+          <w:tcPr>
+            <w:tcW w:type="dxa" w:w="2771"/>
+          </w:tcPr>
+          <w:p>
+            <w:r/>
+            <w:r>
+              <w:rPr>
+                <w:rFonts w:ascii="Times New Roman" w:hAnsi="Times New Roman"/>
+                <w:sz w:val="18"/>
+              </w:rPr>
+              <w:t>100%</w:t>
+            </w:r>
+          </w:p>
+        </w:tc>
+      </w:tr>
+      <w:tr>
+        <w:tc>
+          <w:tcPr>
+            <w:tcW w:type="dxa" w:w="2771"/>
+          </w:tcPr>
+          <w:p>
+            <w:r/>
+            <w:r>
+              <w:rPr>
+                <w:rFonts w:ascii="Times New Roman" w:hAnsi="Times New Roman"/>
+                <w:sz w:val="18"/>
+              </w:rPr>
+              <w:t>raster × raster</w:t>
+            </w:r>
+          </w:p>
+        </w:tc>
+        <w:tc>
+          <w:tcPr>
+            <w:tcW w:type="dxa" w:w="2771"/>
+          </w:tcPr>
+          <w:p>
+            <w:r/>
+            <w:r>
+              <w:rPr>
+                <w:rFonts w:ascii="Times New Roman" w:hAnsi="Times New Roman"/>
+                <w:sz w:val="18"/>
+              </w:rPr>
+              <w:t>2</w:t>
+            </w:r>
+          </w:p>
+        </w:tc>
+        <w:tc>
+          <w:tcPr>
+            <w:tcW w:type="dxa" w:w="2771"/>
+          </w:tcPr>
+          <w:p>
+            <w:r/>
+            <w:r>
+              <w:rPr>
+                <w:rFonts w:ascii="Times New Roman" w:hAnsi="Times New Roman"/>
+                <w:sz w:val="18"/>
+              </w:rPr>
+              <w:t>100%</w:t>
+            </w:r>
+          </w:p>
+        </w:tc>
+      </w:tr>
+      <w:tr>
+        <w:tc>
+          <w:tcPr>
+            <w:tcW w:type="dxa" w:w="2771"/>
+          </w:tcPr>
+          <w:p>
+            <w:r/>
+            <w:r>
+              <w:rPr>
+                <w:rFonts w:ascii="Times New Roman" w:hAnsi="Times New Roman"/>
+                <w:sz w:val="18"/>
+              </w:rPr>
+              <w:t>跨模态特殊</w:t>
+            </w:r>
+          </w:p>
+        </w:tc>
+        <w:tc>
+          <w:tcPr>
+            <w:tcW w:type="dxa" w:w="2771"/>
+          </w:tcPr>
+          <w:p>
+            <w:r/>
+            <w:r>
+              <w:rPr>
+                <w:rFonts w:ascii="Times New Roman" w:hAnsi="Times New Roman"/>
+                <w:sz w:val="18"/>
+              </w:rPr>
+              <w:t>4</w:t>
+            </w:r>
+          </w:p>
+        </w:tc>
+        <w:tc>
+          <w:tcPr>
+            <w:tcW w:type="dxa" w:w="2771"/>
+          </w:tcPr>
+          <w:p>
+            <w:r/>
+            <w:r>
+              <w:rPr>
+                <w:rFonts w:ascii="Times New Roman" w:hAnsi="Times New Roman"/>
+                <w:sz w:val="18"/>
+              </w:rPr>
+              <w:t>100%</w:t>
+            </w:r>
+          </w:p>
+        </w:tc>
+      </w:tr>
+      <w:tr>
+        <w:tc>
+          <w:tcPr>
+            <w:tcW w:type="dxa" w:w="2771"/>
+          </w:tcPr>
+          <w:p>
+            <w:r/>
+            <w:r>
+              <w:rPr>
+                <w:rFonts w:ascii="Times New Roman" w:hAnsi="Times New Roman"/>
+                <w:sz w:val="18"/>
+              </w:rPr>
+              <w:t>**总体**</w:t>
+            </w:r>
+          </w:p>
+        </w:tc>
+        <w:tc>
+          <w:tcPr>
+            <w:tcW w:type="dxa" w:w="2771"/>
+          </w:tcPr>
+          <w:p>
+            <w:r/>
+            <w:r>
+              <w:rPr>
+                <w:rFonts w:ascii="Times New Roman" w:hAnsi="Times New Roman"/>
+                <w:sz w:val="18"/>
+              </w:rPr>
+              <w:t>**30**</w:t>
+            </w:r>
+          </w:p>
+        </w:tc>
+        <w:tc>
+          <w:tcPr>
+            <w:tcW w:type="dxa" w:w="2771"/>
+          </w:tcPr>
+          <w:p>
+            <w:r/>
+            <w:r>
+              <w:rPr>
+                <w:rFonts w:ascii="Times New Roman" w:hAnsi="Times New Roman"/>
+                <w:sz w:val="18"/>
+              </w:rPr>
+              <w:t>**100%**</w:t>
+            </w:r>
+          </w:p>
+        </w:tc>
+      </w:tr>
+    </w:tbl>
+    <w:p>
+      <w:pPr>
+        <w:pStyle w:val="Heading3"/>
+      </w:pPr>
+      <w:r>
+        <w:t>6.5.3 单位转换精度</w:t>
+      </w:r>
+    </w:p>
+    <w:p>
+      <w:r>
+        <w:t>对 8 组双向转换对（m²↔亩、亩↔ha、m²↔ha、m↔km）执行 `_apply_unit_conversions()`，验证数值精度：</w:t>
+      </w:r>
+    </w:p>
+    <w:p>
+      <w:pPr>
+        <w:pStyle w:val="ListBullet"/>
+      </w:pPr>
+      <w:r>
+        <w:t>**最大相对误差**: 0.00（浮点精度级，零误差）</w:t>
+      </w:r>
+    </w:p>
+    <w:p>
+      <w:pPr>
+        <w:pStyle w:val="ListBullet"/>
+      </w:pPr>
+      <w:r>
+        <w:t>**支持转换对数**: 8</w:t>
+      </w:r>
+    </w:p>
+    <w:p>
+      <w:pPr>
+        <w:pStyle w:val="Heading3"/>
+      </w:pPr>
+      <w:r>
+        <w:t>6.5.4 兼容性评分准确率</w:t>
+      </w:r>
+    </w:p>
+    <w:p>
+      <w:r>
+        <w:t>构造 15 个数据对（高/中/低兼容性各 5 个），验证 `assess_compatibility()` 评分是否落在预期区间：</w:t>
+      </w:r>
+    </w:p>
+    <w:tbl>
+      <w:tblPr>
+        <w:tblStyle w:val="TableGrid"/>
+        <w:tblW w:type="auto" w:w="0"/>
+        <w:jc w:val="center"/>
+        <w:tblLook w:firstColumn="1" w:firstRow="1" w:lastColumn="0" w:lastRow="0" w:noHBand="0" w:noVBand="1" w:val="04A0"/>
+      </w:tblPr>
+      <w:tblGrid>
+        <w:gridCol w:w="2771"/>
+        <w:gridCol w:w="2771"/>
+        <w:gridCol w:w="2771"/>
+      </w:tblGrid>
+      <w:tr>
+        <w:tc>
+          <w:tcPr>
+            <w:tcW w:type="dxa" w:w="2771"/>
+          </w:tcPr>
+          <w:p>
+            <w:r/>
+            <w:r>
+              <w:rPr>
+                <w:rFonts w:ascii="Times New Roman" w:hAnsi="Times New Roman"/>
+                <w:b/>
+                <w:sz w:val="18"/>
+              </w:rPr>
+              <w:t>兼容性等级</w:t>
+            </w:r>
+          </w:p>
+        </w:tc>
+        <w:tc>
+          <w:tcPr>
+            <w:tcW w:type="dxa" w:w="2771"/>
+          </w:tcPr>
+          <w:p>
+            <w:r/>
+            <w:r>
+              <w:rPr>
+                <w:rFonts w:ascii="Times New Roman" w:hAnsi="Times New Roman"/>
+                <w:b/>
+                <w:sz w:val="18"/>
+              </w:rPr>
+              <w:t>预期区间</w:t>
+            </w:r>
+          </w:p>
+        </w:tc>
+        <w:tc>
+          <w:tcPr>
+            <w:tcW w:type="dxa" w:w="2771"/>
+          </w:tcPr>
+          <w:p>
+            <w:r/>
+            <w:r>
+              <w:rPr>
+                <w:rFonts w:ascii="Times New Roman" w:hAnsi="Times New Roman"/>
+                <w:b/>
+                <w:sz w:val="18"/>
+              </w:rPr>
+              <w:t>命中率</w:t>
+            </w:r>
+          </w:p>
+        </w:tc>
+      </w:tr>
+      <w:tr>
+        <w:tc>
+          <w:tcPr>
+            <w:tcW w:type="dxa" w:w="2771"/>
+          </w:tcPr>
+          <w:p>
+            <w:r/>
+            <w:r>
+              <w:rPr>
+                <w:rFonts w:ascii="Times New Roman" w:hAnsi="Times New Roman"/>
+                <w:sz w:val="18"/>
+              </w:rPr>
+              <w:t>高（同CRS+重叠+共享字段）</w:t>
+            </w:r>
+          </w:p>
+        </w:tc>
+        <w:tc>
+          <w:tcPr>
+            <w:tcW w:type="dxa" w:w="2771"/>
+          </w:tcPr>
+          <w:p>
+            <w:r/>
+            <w:r>
+              <w:rPr>
+                <w:rFonts w:ascii="Times New Roman" w:hAnsi="Times New Roman"/>
+                <w:sz w:val="18"/>
+              </w:rPr>
+              <w:t>0.7–1.0</w:t>
+            </w:r>
+          </w:p>
+        </w:tc>
+        <w:tc>
+          <w:tcPr>
+            <w:tcW w:type="dxa" w:w="2771"/>
+          </w:tcPr>
+          <w:p>
+            <w:r/>
+            <w:r>
+              <w:rPr>
+                <w:rFonts w:ascii="Times New Roman" w:hAnsi="Times New Roman"/>
+                <w:sz w:val="18"/>
+              </w:rPr>
+              <w:t>100%</w:t>
+            </w:r>
+          </w:p>
+        </w:tc>
+      </w:tr>
+      <w:tr>
+        <w:tc>
+          <w:tcPr>
+            <w:tcW w:type="dxa" w:w="2771"/>
+          </w:tcPr>
+          <w:p>
+            <w:r/>
+            <w:r>
+              <w:rPr>
+                <w:rFonts w:ascii="Times New Roman" w:hAnsi="Times New Roman"/>
+                <w:sz w:val="18"/>
+              </w:rPr>
+              <w:t>中（不同CRS或部分匹配）</w:t>
+            </w:r>
+          </w:p>
+        </w:tc>
+        <w:tc>
+          <w:tcPr>
+            <w:tcW w:type="dxa" w:w="2771"/>
+          </w:tcPr>
+          <w:p>
+            <w:r/>
+            <w:r>
+              <w:rPr>
+                <w:rFonts w:ascii="Times New Roman" w:hAnsi="Times New Roman"/>
+                <w:sz w:val="18"/>
+              </w:rPr>
+              <w:t>0.35–0.95</w:t>
+            </w:r>
+          </w:p>
+        </w:tc>
+        <w:tc>
+          <w:tcPr>
+            <w:tcW w:type="dxa" w:w="2771"/>
+          </w:tcPr>
+          <w:p>
+            <w:r/>
+            <w:r>
+              <w:rPr>
+                <w:rFonts w:ascii="Times New Roman" w:hAnsi="Times New Roman"/>
+                <w:sz w:val="18"/>
+              </w:rPr>
+              <w:t>100%</w:t>
+            </w:r>
+          </w:p>
+        </w:tc>
+      </w:tr>
+      <w:tr>
+        <w:tc>
+          <w:tcPr>
+            <w:tcW w:type="dxa" w:w="2771"/>
+          </w:tcPr>
+          <w:p>
+            <w:r/>
+            <w:r>
+              <w:rPr>
+                <w:rFonts w:ascii="Times New Roman" w:hAnsi="Times New Roman"/>
+                <w:sz w:val="18"/>
+              </w:rPr>
+              <w:t>低（跨类型、无共享字段）</w:t>
+            </w:r>
+          </w:p>
+        </w:tc>
+        <w:tc>
+          <w:tcPr>
+            <w:tcW w:type="dxa" w:w="2771"/>
+          </w:tcPr>
+          <w:p>
+            <w:r/>
+            <w:r>
+              <w:rPr>
+                <w:rFonts w:ascii="Times New Roman" w:hAnsi="Times New Roman"/>
+                <w:sz w:val="18"/>
+              </w:rPr>
+              <w:t>0.2–0.75</w:t>
+            </w:r>
+          </w:p>
+        </w:tc>
+        <w:tc>
+          <w:tcPr>
+            <w:tcW w:type="dxa" w:w="2771"/>
+          </w:tcPr>
+          <w:p>
+            <w:r/>
+            <w:r>
+              <w:rPr>
+                <w:rFonts w:ascii="Times New Roman" w:hAnsi="Times New Roman"/>
+                <w:sz w:val="18"/>
+              </w:rPr>
+              <w:t>100%</w:t>
+            </w:r>
+          </w:p>
+        </w:tc>
+      </w:tr>
+    </w:tbl>
+    <w:p>
+      <w:pPr>
+        <w:pStyle w:val="Heading3"/>
+      </w:pPr>
+      <w:r>
+        <w:t>6.5.5 融合质量评分</w:t>
+      </w:r>
+    </w:p>
+    <w:p>
+      <w:r>
+        <w:t>对 8 种核心策略使用干净合成数据执行融合，收集 `validate_quality()` 的质量分数：</w:t>
+      </w:r>
+    </w:p>
+    <w:tbl>
+      <w:tblPr>
+        <w:tblStyle w:val="TableGrid"/>
+        <w:tblW w:type="auto" w:w="0"/>
+        <w:jc w:val="center"/>
+        <w:tblLook w:firstColumn="1" w:firstRow="1" w:lastColumn="0" w:lastRow="0" w:noHBand="0" w:noVBand="1" w:val="04A0"/>
+      </w:tblPr>
+      <w:tblGrid>
+        <w:gridCol w:w="4156"/>
+        <w:gridCol w:w="4156"/>
+      </w:tblGrid>
+      <w:tr>
+        <w:tc>
+          <w:tcPr>
+            <w:tcW w:type="dxa" w:w="4156"/>
+          </w:tcPr>
+          <w:p>
+            <w:r/>
+            <w:r>
+              <w:rPr>
+                <w:rFonts w:ascii="Times New Roman" w:hAnsi="Times New Roman"/>
+                <w:b/>
+                <w:sz w:val="18"/>
+              </w:rPr>
+              <w:t>策略</w:t>
+            </w:r>
+          </w:p>
+        </w:tc>
+        <w:tc>
+          <w:tcPr>
+            <w:tcW w:type="dxa" w:w="4156"/>
+          </w:tcPr>
+          <w:p>
+            <w:r/>
+            <w:r>
+              <w:rPr>
+                <w:rFonts w:ascii="Times New Roman" w:hAnsi="Times New Roman"/>
+                <w:b/>
+                <w:sz w:val="18"/>
+              </w:rPr>
+              <w:t>质量分数</w:t>
+            </w:r>
+          </w:p>
+        </w:tc>
+      </w:tr>
+      <w:tr>
+        <w:tc>
+          <w:tcPr>
+            <w:tcW w:type="dxa" w:w="4156"/>
+          </w:tcPr>
+          <w:p>
+            <w:r/>
+            <w:r>
+              <w:rPr>
+                <w:rFonts w:ascii="Times New Roman" w:hAnsi="Times New Roman"/>
+                <w:sz w:val="18"/>
+              </w:rPr>
+              <w:t>spatial_join</w:t>
+            </w:r>
+          </w:p>
+        </w:tc>
+        <w:tc>
+          <w:tcPr>
+            <w:tcW w:type="dxa" w:w="4156"/>
+          </w:tcPr>
+          <w:p>
+            <w:r/>
+            <w:r>
+              <w:rPr>
+                <w:rFonts w:ascii="Times New Roman" w:hAnsi="Times New Roman"/>
+                <w:sz w:val="18"/>
+              </w:rPr>
+              <w:t>1.0</w:t>
+            </w:r>
+          </w:p>
+        </w:tc>
+      </w:tr>
+      <w:tr>
+        <w:tc>
+          <w:tcPr>
+            <w:tcW w:type="dxa" w:w="4156"/>
+          </w:tcPr>
+          <w:p>
+            <w:r/>
+            <w:r>
+              <w:rPr>
+                <w:rFonts w:ascii="Times New Roman" w:hAnsi="Times New Roman"/>
+                <w:sz w:val="18"/>
+              </w:rPr>
+              <w:t>overlay</w:t>
+            </w:r>
+          </w:p>
+        </w:tc>
+        <w:tc>
+          <w:tcPr>
+            <w:tcW w:type="dxa" w:w="4156"/>
+          </w:tcPr>
+          <w:p>
+            <w:r/>
+            <w:r>
+              <w:rPr>
+                <w:rFonts w:ascii="Times New Roman" w:hAnsi="Times New Roman"/>
+                <w:sz w:val="18"/>
+              </w:rPr>
+              <w:t>1.0</w:t>
+            </w:r>
+          </w:p>
+        </w:tc>
+      </w:tr>
+      <w:tr>
+        <w:tc>
+          <w:tcPr>
+            <w:tcW w:type="dxa" w:w="4156"/>
+          </w:tcPr>
+          <w:p>
+            <w:r/>
+            <w:r>
+              <w:rPr>
+                <w:rFonts w:ascii="Times New Roman" w:hAnsi="Times New Roman"/>
+                <w:sz w:val="18"/>
+              </w:rPr>
+              <w:t>nearest_join</w:t>
+            </w:r>
+          </w:p>
+        </w:tc>
+        <w:tc>
+          <w:tcPr>
+            <w:tcW w:type="dxa" w:w="4156"/>
+          </w:tcPr>
+          <w:p>
+            <w:r/>
+            <w:r>
+              <w:rPr>
+                <w:rFonts w:ascii="Times New Roman" w:hAnsi="Times New Roman"/>
+                <w:sz w:val="18"/>
+              </w:rPr>
+              <w:t>1.0</w:t>
+            </w:r>
+          </w:p>
+        </w:tc>
+      </w:tr>
+      <w:tr>
+        <w:tc>
+          <w:tcPr>
+            <w:tcW w:type="dxa" w:w="4156"/>
+          </w:tcPr>
+          <w:p>
+            <w:r/>
+            <w:r>
+              <w:rPr>
+                <w:rFonts w:ascii="Times New Roman" w:hAnsi="Times New Roman"/>
+                <w:sz w:val="18"/>
+              </w:rPr>
+              <w:t>attribute_join</w:t>
+            </w:r>
+          </w:p>
+        </w:tc>
+        <w:tc>
+          <w:tcPr>
+            <w:tcW w:type="dxa" w:w="4156"/>
+          </w:tcPr>
+          <w:p>
+            <w:r/>
+            <w:r>
+              <w:rPr>
+                <w:rFonts w:ascii="Times New Roman" w:hAnsi="Times New Roman"/>
+                <w:sz w:val="18"/>
+              </w:rPr>
+              <w:t>1.0</w:t>
+            </w:r>
+          </w:p>
+        </w:tc>
+      </w:tr>
+      <w:tr>
+        <w:tc>
+          <w:tcPr>
+            <w:tcW w:type="dxa" w:w="4156"/>
+          </w:tcPr>
+          <w:p>
+            <w:r/>
+            <w:r>
+              <w:rPr>
+                <w:rFonts w:ascii="Times New Roman" w:hAnsi="Times New Roman"/>
+                <w:sz w:val="18"/>
+              </w:rPr>
+              <w:t>zonal_statistics</w:t>
+            </w:r>
+          </w:p>
+        </w:tc>
+        <w:tc>
+          <w:tcPr>
+            <w:tcW w:type="dxa" w:w="4156"/>
+          </w:tcPr>
+          <w:p>
+            <w:r/>
+            <w:r>
+              <w:rPr>
+                <w:rFonts w:ascii="Times New Roman" w:hAnsi="Times New Roman"/>
+                <w:sz w:val="18"/>
+              </w:rPr>
+              <w:t>0.7</w:t>
+            </w:r>
+          </w:p>
+        </w:tc>
+      </w:tr>
+      <w:tr>
+        <w:tc>
+          <w:tcPr>
+            <w:tcW w:type="dxa" w:w="4156"/>
+          </w:tcPr>
+          <w:p>
+            <w:r/>
+            <w:r>
+              <w:rPr>
+                <w:rFonts w:ascii="Times New Roman" w:hAnsi="Times New Roman"/>
+                <w:sz w:val="18"/>
+              </w:rPr>
+              <w:t>point_sampling</w:t>
+            </w:r>
+          </w:p>
+        </w:tc>
+        <w:tc>
+          <w:tcPr>
+            <w:tcW w:type="dxa" w:w="4156"/>
+          </w:tcPr>
+          <w:p>
+            <w:r/>
+            <w:r>
+              <w:rPr>
+                <w:rFonts w:ascii="Times New Roman" w:hAnsi="Times New Roman"/>
+                <w:sz w:val="18"/>
+              </w:rPr>
+              <w:t>1.0</w:t>
+            </w:r>
+          </w:p>
+        </w:tc>
+      </w:tr>
+      <w:tr>
+        <w:tc>
+          <w:tcPr>
+            <w:tcW w:type="dxa" w:w="4156"/>
+          </w:tcPr>
+          <w:p>
+            <w:r/>
+            <w:r>
+              <w:rPr>
+                <w:rFonts w:ascii="Times New Roman" w:hAnsi="Times New Roman"/>
+                <w:sz w:val="18"/>
+              </w:rPr>
+              <w:t>band_stack</w:t>
+            </w:r>
+          </w:p>
+        </w:tc>
+        <w:tc>
+          <w:tcPr>
+            <w:tcW w:type="dxa" w:w="4156"/>
+          </w:tcPr>
+          <w:p>
+            <w:r/>
+            <w:r>
+              <w:rPr>
+                <w:rFonts w:ascii="Times New Roman" w:hAnsi="Times New Roman"/>
+                <w:sz w:val="18"/>
+              </w:rPr>
+              <w:t>1.0</w:t>
+            </w:r>
+          </w:p>
+        </w:tc>
+      </w:tr>
+      <w:tr>
+        <w:tc>
+          <w:tcPr>
+            <w:tcW w:type="dxa" w:w="4156"/>
+          </w:tcPr>
+          <w:p>
+            <w:r/>
+            <w:r>
+              <w:rPr>
+                <w:rFonts w:ascii="Times New Roman" w:hAnsi="Times New Roman"/>
+                <w:sz w:val="18"/>
+              </w:rPr>
+              <w:t>raster_vectorize</w:t>
+            </w:r>
+          </w:p>
+        </w:tc>
+        <w:tc>
+          <w:tcPr>
+            <w:tcW w:type="dxa" w:w="4156"/>
+          </w:tcPr>
+          <w:p>
+            <w:r/>
+            <w:r>
+              <w:rPr>
+                <w:rFonts w:ascii="Times New Roman" w:hAnsi="Times New Roman"/>
+                <w:sz w:val="18"/>
+              </w:rPr>
+              <w:t>1.0</w:t>
+            </w:r>
+          </w:p>
+        </w:tc>
+      </w:tr>
+      <w:tr>
+        <w:tc>
+          <w:tcPr>
+            <w:tcW w:type="dxa" w:w="4156"/>
+          </w:tcPr>
+          <w:p>
+            <w:r/>
+            <w:r>
+              <w:rPr>
+                <w:rFonts w:ascii="Times New Roman" w:hAnsi="Times New Roman"/>
+                <w:sz w:val="18"/>
+              </w:rPr>
+              <w:t>**均值 ± 标准差**</w:t>
+            </w:r>
+          </w:p>
+        </w:tc>
+        <w:tc>
+          <w:tcPr>
+            <w:tcW w:type="dxa" w:w="4156"/>
+          </w:tcPr>
+          <w:p>
+            <w:r/>
+            <w:r>
+              <w:rPr>
+                <w:rFonts w:ascii="Times New Roman" w:hAnsi="Times New Roman"/>
+                <w:sz w:val="18"/>
+              </w:rPr>
+              <w:t>**0.96 ± 0.10**</w:t>
+            </w:r>
+          </w:p>
+        </w:tc>
+      </w:tr>
+    </w:tbl>
+    <w:p>
+      <w:pPr>
+        <w:pStyle w:val="Heading3"/>
+      </w:pPr>
+      <w:r>
+        <w:t>6.5.6 异常检测率</w:t>
+      </w:r>
+    </w:p>
+    <w:p>
+      <w:r>
+        <w:t>向干净数据注入 7 类已知缺陷，验证 `validate_quality()` 的检出能力：</w:t>
+      </w:r>
+    </w:p>
+    <w:tbl>
+      <w:tblPr>
+        <w:tblStyle w:val="TableGrid"/>
+        <w:tblW w:type="auto" w:w="0"/>
+        <w:jc w:val="center"/>
+        <w:tblLook w:firstColumn="1" w:firstRow="1" w:lastColumn="0" w:lastRow="0" w:noHBand="0" w:noVBand="1" w:val="04A0"/>
+      </w:tblPr>
+      <w:tblGrid>
+        <w:gridCol w:w="4156"/>
+        <w:gridCol w:w="4156"/>
+      </w:tblGrid>
+      <w:tr>
+        <w:tc>
+          <w:tcPr>
+            <w:tcW w:type="dxa" w:w="4156"/>
+          </w:tcPr>
+          <w:p>
+            <w:r/>
+            <w:r>
+              <w:rPr>
+                <w:rFonts w:ascii="Times New Roman" w:hAnsi="Times New Roman"/>
+                <w:b/>
+                <w:sz w:val="18"/>
+              </w:rPr>
+              <w:t>缺陷类型</w:t>
+            </w:r>
+          </w:p>
+        </w:tc>
+        <w:tc>
+          <w:tcPr>
+            <w:tcW w:type="dxa" w:w="4156"/>
+          </w:tcPr>
+          <w:p>
+            <w:r/>
+            <w:r>
+              <w:rPr>
+                <w:rFonts w:ascii="Times New Roman" w:hAnsi="Times New Roman"/>
+                <w:b/>
+                <w:sz w:val="18"/>
+              </w:rPr>
+              <w:t>检出</w:t>
+            </w:r>
+          </w:p>
+        </w:tc>
+      </w:tr>
+      <w:tr>
+        <w:tc>
+          <w:tcPr>
+            <w:tcW w:type="dxa" w:w="4156"/>
+          </w:tcPr>
+          <w:p>
+            <w:r/>
+            <w:r>
+              <w:rPr>
+                <w:rFonts w:ascii="Times New Roman" w:hAnsi="Times New Roman"/>
+                <w:sz w:val="18"/>
+              </w:rPr>
+              <w:t>高空值率（60%）</w:t>
+            </w:r>
+          </w:p>
+        </w:tc>
+        <w:tc>
+          <w:tcPr>
+            <w:tcW w:type="dxa" w:w="4156"/>
+          </w:tcPr>
+          <w:p>
+            <w:r/>
+            <w:r>
+              <w:rPr>
+                <w:rFonts w:ascii="Times New Roman" w:hAnsi="Times New Roman"/>
+                <w:sz w:val="18"/>
+              </w:rPr>
+              <w:t>✅</w:t>
+            </w:r>
+          </w:p>
+        </w:tc>
+      </w:tr>
+      <w:tr>
+        <w:tc>
+          <w:tcPr>
+            <w:tcW w:type="dxa" w:w="4156"/>
+          </w:tcPr>
+          <w:p>
+            <w:r/>
+            <w:r>
+              <w:rPr>
+                <w:rFonts w:ascii="Times New Roman" w:hAnsi="Times New Roman"/>
+                <w:sz w:val="18"/>
+              </w:rPr>
+              <w:t>无效几何（自相交）</w:t>
+            </w:r>
+          </w:p>
+        </w:tc>
+        <w:tc>
+          <w:tcPr>
+            <w:tcW w:type="dxa" w:w="4156"/>
+          </w:tcPr>
+          <w:p>
+            <w:r/>
+            <w:r>
+              <w:rPr>
+                <w:rFonts w:ascii="Times New Roman" w:hAnsi="Times New Roman"/>
+                <w:sz w:val="18"/>
+              </w:rPr>
+              <w:t>✅</w:t>
+            </w:r>
+          </w:p>
+        </w:tc>
+      </w:tr>
+      <w:tr>
+        <w:tc>
+          <w:tcPr>
+            <w:tcW w:type="dxa" w:w="4156"/>
+          </w:tcPr>
+          <w:p>
+            <w:r/>
+            <w:r>
+              <w:rPr>
+                <w:rFonts w:ascii="Times New Roman" w:hAnsi="Times New Roman"/>
+                <w:sz w:val="18"/>
+              </w:rPr>
+              <w:t>极端异常值（&gt;5×IQR）</w:t>
+            </w:r>
+          </w:p>
+        </w:tc>
+        <w:tc>
+          <w:tcPr>
+            <w:tcW w:type="dxa" w:w="4156"/>
+          </w:tcPr>
+          <w:p>
+            <w:r/>
+            <w:r>
+              <w:rPr>
+                <w:rFonts w:ascii="Times New Roman" w:hAnsi="Times New Roman"/>
+                <w:sz w:val="18"/>
+              </w:rPr>
+              <w:t>✅</w:t>
+            </w:r>
+          </w:p>
+        </w:tc>
+      </w:tr>
+      <w:tr>
+        <w:tc>
+          <w:tcPr>
+            <w:tcW w:type="dxa" w:w="4156"/>
+          </w:tcPr>
+          <w:p>
+            <w:r/>
+            <w:r>
+              <w:rPr>
+                <w:rFonts w:ascii="Times New Roman" w:hAnsi="Times New Roman"/>
+                <w:sz w:val="18"/>
+              </w:rPr>
+              <w:t>微面多边形（&lt;0.1%中位面积）</w:t>
+            </w:r>
+          </w:p>
+        </w:tc>
+        <w:tc>
+          <w:tcPr>
+            <w:tcW w:type="dxa" w:w="4156"/>
+          </w:tcPr>
+          <w:p>
+            <w:r/>
+            <w:r>
+              <w:rPr>
+                <w:rFonts w:ascii="Times New Roman" w:hAnsi="Times New Roman"/>
+                <w:sz w:val="18"/>
+              </w:rPr>
+              <w:t>✅</w:t>
+            </w:r>
+          </w:p>
+        </w:tc>
+      </w:tr>
+      <w:tr>
+        <w:tc>
+          <w:tcPr>
+            <w:tcW w:type="dxa" w:w="4156"/>
+          </w:tcPr>
+          <w:p>
+            <w:r/>
+            <w:r>
+              <w:rPr>
+                <w:rFonts w:ascii="Times New Roman" w:hAnsi="Times New Roman"/>
+                <w:sz w:val="18"/>
+              </w:rPr>
+              <w:t>拓扑错误（自相交多边形）</w:t>
+            </w:r>
+          </w:p>
+        </w:tc>
+        <w:tc>
+          <w:tcPr>
+            <w:tcW w:type="dxa" w:w="4156"/>
+          </w:tcPr>
+          <w:p>
+            <w:r/>
+            <w:r>
+              <w:rPr>
+                <w:rFonts w:ascii="Times New Roman" w:hAnsi="Times New Roman"/>
+                <w:sz w:val="18"/>
+              </w:rPr>
+              <w:t>✅</w:t>
+            </w:r>
+          </w:p>
+        </w:tc>
+      </w:tr>
+      <w:tr>
+        <w:tc>
+          <w:tcPr>
+            <w:tcW w:type="dxa" w:w="4156"/>
+          </w:tcPr>
+          <w:p>
+            <w:r/>
+            <w:r>
+              <w:rPr>
+                <w:rFonts w:ascii="Times New Roman" w:hAnsi="Times New Roman"/>
+                <w:sz w:val="18"/>
+              </w:rPr>
+              <w:t>行丢失（&lt;50%输入）</w:t>
+            </w:r>
+          </w:p>
+        </w:tc>
+        <w:tc>
+          <w:tcPr>
+            <w:tcW w:type="dxa" w:w="4156"/>
+          </w:tcPr>
+          <w:p>
+            <w:r/>
+            <w:r>
+              <w:rPr>
+                <w:rFonts w:ascii="Times New Roman" w:hAnsi="Times New Roman"/>
+                <w:sz w:val="18"/>
+              </w:rPr>
+              <w:t>✅</w:t>
+            </w:r>
+          </w:p>
+        </w:tc>
+      </w:tr>
+      <w:tr>
+        <w:tc>
+          <w:tcPr>
+            <w:tcW w:type="dxa" w:w="4156"/>
+          </w:tcPr>
+          <w:p>
+            <w:r/>
+            <w:r>
+              <w:rPr>
+                <w:rFonts w:ascii="Times New Roman" w:hAnsi="Times New Roman"/>
+                <w:sz w:val="18"/>
+              </w:rPr>
+              <w:t>空结果（0行）</w:t>
+            </w:r>
+          </w:p>
+        </w:tc>
+        <w:tc>
+          <w:tcPr>
+            <w:tcW w:type="dxa" w:w="4156"/>
+          </w:tcPr>
+          <w:p>
+            <w:r/>
+            <w:r>
+              <w:rPr>
+                <w:rFonts w:ascii="Times New Roman" w:hAnsi="Times New Roman"/>
+                <w:sz w:val="18"/>
+              </w:rPr>
+              <w:t>✅</w:t>
+            </w:r>
+          </w:p>
+        </w:tc>
+      </w:tr>
+      <w:tr>
+        <w:tc>
+          <w:tcPr>
+            <w:tcW w:type="dxa" w:w="4156"/>
+          </w:tcPr>
+          <w:p>
+            <w:r/>
+            <w:r>
+              <w:rPr>
+                <w:rFonts w:ascii="Times New Roman" w:hAnsi="Times New Roman"/>
+                <w:sz w:val="18"/>
+              </w:rPr>
+              <w:t>**检出率**</w:t>
+            </w:r>
+          </w:p>
+        </w:tc>
+        <w:tc>
+          <w:tcPr>
+            <w:tcW w:type="dxa" w:w="4156"/>
+          </w:tcPr>
+          <w:p>
+            <w:r/>
+            <w:r>
+              <w:rPr>
+                <w:rFonts w:ascii="Times New Roman" w:hAnsi="Times New Roman"/>
+                <w:sz w:val="18"/>
+              </w:rPr>
+              <w:t>**100%（7/7）**</w:t>
+            </w:r>
+          </w:p>
+        </w:tc>
+      </w:tr>
+    </w:tbl>
+    <w:p>
+      <w:pPr>
+        <w:pStyle w:val="Heading3"/>
+      </w:pPr>
+      <w:r>
+        <w:t>6.5.7 数据完整性保持率</w:t>
+      </w:r>
+    </w:p>
+    <w:p>
+      <w:r>
+        <w:t>对 6 种核心策略测量输出相对于输入的保持率：</w:t>
+      </w:r>
+    </w:p>
+    <w:p>
+      <w:pPr>
+        <w:pStyle w:val="ListBullet"/>
+      </w:pPr>
+      <w:r>
+        <w:t>**平均行保持率**: 1.00（≥0.80阈值）</w:t>
+      </w:r>
+    </w:p>
+    <w:p>
+      <w:pPr>
+        <w:pStyle w:val="ListBullet"/>
+      </w:pPr>
+      <w:r>
+        <w:t>**平均几何有效率**: 1.00（≥0.99阈值）</w:t>
+      </w:r>
+    </w:p>
+    <w:p>
+      <w:pPr>
+        <w:pStyle w:val="Heading3"/>
+      </w:pPr>
+      <w:r>
+        <w:t>6.5.8 模态与策略覆盖度</w:t>
+      </w:r>
+    </w:p>
+    <w:tbl>
+      <w:tblPr>
+        <w:tblStyle w:val="TableGrid"/>
+        <w:tblW w:type="auto" w:w="0"/>
+        <w:jc w:val="center"/>
+        <w:tblLook w:firstColumn="1" w:firstRow="1" w:lastColumn="0" w:lastRow="0" w:noHBand="0" w:noVBand="1" w:val="04A0"/>
+      </w:tblPr>
+      <w:tblGrid>
+        <w:gridCol w:w="4156"/>
+        <w:gridCol w:w="4156"/>
+      </w:tblGrid>
+      <w:tr>
+        <w:tc>
+          <w:tcPr>
+            <w:tcW w:type="dxa" w:w="4156"/>
+          </w:tcPr>
+          <w:p>
+            <w:r/>
+            <w:r>
+              <w:rPr>
+                <w:rFonts w:ascii="Times New Roman" w:hAnsi="Times New Roman"/>
+                <w:b/>
+                <w:sz w:val="18"/>
+              </w:rPr>
+              <w:t>维度</w:t>
+            </w:r>
+          </w:p>
+        </w:tc>
+        <w:tc>
+          <w:tcPr>
+            <w:tcW w:type="dxa" w:w="4156"/>
+          </w:tcPr>
+          <w:p>
+            <w:r/>
+            <w:r>
+              <w:rPr>
+                <w:rFonts w:ascii="Times New Roman" w:hAnsi="Times New Roman"/>
+                <w:b/>
+                <w:sz w:val="18"/>
+              </w:rPr>
+              <w:t>覆盖</w:t>
+            </w:r>
+          </w:p>
+        </w:tc>
+      </w:tr>
+      <w:tr>
+        <w:tc>
+          <w:tcPr>
+            <w:tcW w:type="dxa" w:w="4156"/>
+          </w:tcPr>
+          <w:p>
+            <w:r/>
+            <w:r>
+              <w:rPr>
+                <w:rFonts w:ascii="Times New Roman" w:hAnsi="Times New Roman"/>
+                <w:sz w:val="18"/>
+              </w:rPr>
+              <w:t>数据模态</w:t>
+            </w:r>
+          </w:p>
+        </w:tc>
+        <w:tc>
+          <w:tcPr>
+            <w:tcW w:type="dxa" w:w="4156"/>
+          </w:tcPr>
+          <w:p>
+            <w:r/>
+            <w:r>
+              <w:rPr>
+                <w:rFonts w:ascii="Times New Roman" w:hAnsi="Times New Roman"/>
+                <w:sz w:val="18"/>
+              </w:rPr>
+              <w:t>5/5（矢量、栅格、表格、点云、实时流）</w:t>
+            </w:r>
+          </w:p>
+        </w:tc>
+      </w:tr>
+      <w:tr>
+        <w:tc>
+          <w:tcPr>
+            <w:tcW w:type="dxa" w:w="4156"/>
+          </w:tcPr>
+          <w:p>
+            <w:r/>
+            <w:r>
+              <w:rPr>
+                <w:rFonts w:ascii="Times New Roman" w:hAnsi="Times New Roman"/>
+                <w:sz w:val="18"/>
+              </w:rPr>
+              <w:t>融合策略</w:t>
+            </w:r>
+          </w:p>
+        </w:tc>
+        <w:tc>
+          <w:tcPr>
+            <w:tcW w:type="dxa" w:w="4156"/>
+          </w:tcPr>
+          <w:p>
+            <w:r/>
+            <w:r>
+              <w:rPr>
+                <w:rFonts w:ascii="Times New Roman" w:hAnsi="Times New Roman"/>
+                <w:sz w:val="18"/>
+              </w:rPr>
+              <w:t>10/10</w:t>
+            </w:r>
+          </w:p>
+        </w:tc>
+      </w:tr>
+      <w:tr>
+        <w:tc>
+          <w:tcPr>
+            <w:tcW w:type="dxa" w:w="4156"/>
+          </w:tcPr>
+          <w:p>
+            <w:r/>
+            <w:r>
+              <w:rPr>
+                <w:rFonts w:ascii="Times New Roman" w:hAnsi="Times New Roman"/>
+                <w:sz w:val="18"/>
+              </w:rPr>
+              <w:t>类型对映射</w:t>
+            </w:r>
+          </w:p>
+        </w:tc>
+        <w:tc>
+          <w:tcPr>
+            <w:tcW w:type="dxa" w:w="4156"/>
+          </w:tcPr>
+          <w:p>
+            <w:r/>
+            <w:r>
+              <w:rPr>
+                <w:rFonts w:ascii="Times New Roman" w:hAnsi="Times New Roman"/>
+                <w:sz w:val="18"/>
+              </w:rPr>
+              <w:t>11/11</w:t>
+            </w:r>
+          </w:p>
+        </w:tc>
+      </w:tr>
+      <w:tr>
+        <w:tc>
+          <w:tcPr>
+            <w:tcW w:type="dxa" w:w="4156"/>
+          </w:tcPr>
+          <w:p>
+            <w:r/>
+            <w:r>
+              <w:rPr>
+                <w:rFonts w:ascii="Times New Roman" w:hAnsi="Times New Roman"/>
+                <w:sz w:val="18"/>
+              </w:rPr>
+              <w:t>质量检查项</w:t>
+            </w:r>
+          </w:p>
+        </w:tc>
+        <w:tc>
+          <w:tcPr>
+            <w:tcW w:type="dxa" w:w="4156"/>
+          </w:tcPr>
+          <w:p>
+            <w:r/>
+            <w:r>
+              <w:rPr>
+                <w:rFonts w:ascii="Times New Roman" w:hAnsi="Times New Roman"/>
+                <w:sz w:val="18"/>
+              </w:rPr>
+              <w:t>10/10</w:t>
+            </w:r>
+          </w:p>
+        </w:tc>
+      </w:tr>
+      <w:tr>
+        <w:tc>
+          <w:tcPr>
+            <w:tcW w:type="dxa" w:w="4156"/>
+          </w:tcPr>
+          <w:p>
+            <w:r/>
+            <w:r>
+              <w:rPr>
+                <w:rFonts w:ascii="Times New Roman" w:hAnsi="Times New Roman"/>
+                <w:sz w:val="18"/>
+              </w:rPr>
+              <w:t>单位转换对</w:t>
+            </w:r>
+          </w:p>
+        </w:tc>
+        <w:tc>
+          <w:tcPr>
+            <w:tcW w:type="dxa" w:w="4156"/>
+          </w:tcPr>
+          <w:p>
+            <w:r/>
+            <w:r>
+              <w:rPr>
+                <w:rFonts w:ascii="Times New Roman" w:hAnsi="Times New Roman"/>
+                <w:sz w:val="18"/>
+              </w:rPr>
+              <w:t>8</w:t>
+            </w:r>
+          </w:p>
+        </w:tc>
+      </w:tr>
+      <w:tr>
+        <w:tc>
+          <w:tcPr>
+            <w:tcW w:type="dxa" w:w="4156"/>
+          </w:tcPr>
+          <w:p>
+            <w:r/>
+            <w:r>
+              <w:rPr>
+                <w:rFonts w:ascii="Times New Roman" w:hAnsi="Times New Roman"/>
+                <w:sz w:val="18"/>
+              </w:rPr>
+              <w:t>语义等价组</w:t>
+            </w:r>
+          </w:p>
+        </w:tc>
+        <w:tc>
+          <w:tcPr>
+            <w:tcW w:type="dxa" w:w="4156"/>
+          </w:tcPr>
+          <w:p>
+            <w:r/>
+            <w:r>
+              <w:rPr>
+                <w:rFonts w:ascii="Times New Roman" w:hAnsi="Times New Roman"/>
+                <w:sz w:val="18"/>
+              </w:rPr>
+              <w:t>10</w:t>
+            </w:r>
+          </w:p>
+        </w:tc>
+      </w:tr>
+    </w:tbl>
+    <w:p>
+      <w:pPr>
+        <w:pStyle w:val="Heading3"/>
+      </w:pPr>
+      <w:r>
+        <w:t>6.5.9 处理性能</w:t>
+      </w:r>
+    </w:p>
+    <w:p>
+      <w:r>
+        <w:t>在不同规模的合成数据上测量 spatial_join 的端到端耗时：</w:t>
+      </w:r>
+    </w:p>
+    <w:tbl>
+      <w:tblPr>
+        <w:tblStyle w:val="TableGrid"/>
+        <w:tblW w:type="auto" w:w="0"/>
+        <w:jc w:val="center"/>
+        <w:tblLook w:firstColumn="1" w:firstRow="1" w:lastColumn="0" w:lastRow="0" w:noHBand="0" w:noVBand="1" w:val="04A0"/>
+      </w:tblPr>
+      <w:tblGrid>
+        <w:gridCol w:w="2771"/>
+        <w:gridCol w:w="2771"/>
+        <w:gridCol w:w="2771"/>
+      </w:tblGrid>
+      <w:tr>
+        <w:tc>
+          <w:tcPr>
+            <w:tcW w:type="dxa" w:w="2771"/>
+          </w:tcPr>
+          <w:p>
+            <w:r/>
+            <w:r>
+              <w:rPr>
+                <w:rFonts w:ascii="Times New Roman" w:hAnsi="Times New Roman"/>
+                <w:b/>
+                <w:sz w:val="18"/>
+              </w:rPr>
+              <w:t>数据规模</w:t>
+            </w:r>
+          </w:p>
+        </w:tc>
+        <w:tc>
+          <w:tcPr>
+            <w:tcW w:type="dxa" w:w="2771"/>
+          </w:tcPr>
+          <w:p>
+            <w:r/>
+            <w:r>
+              <w:rPr>
+                <w:rFonts w:ascii="Times New Roman" w:hAnsi="Times New Roman"/>
+                <w:b/>
+                <w:sz w:val="18"/>
+              </w:rPr>
+              <w:t>总耗时</w:t>
+            </w:r>
+          </w:p>
+        </w:tc>
+        <w:tc>
+          <w:tcPr>
+            <w:tcW w:type="dxa" w:w="2771"/>
+          </w:tcPr>
+          <w:p>
+            <w:r/>
+            <w:r>
+              <w:rPr>
+                <w:rFonts w:ascii="Times New Roman" w:hAnsi="Times New Roman"/>
+                <w:b/>
+                <w:sz w:val="18"/>
+              </w:rPr>
+              <w:t>吞吐量</w:t>
+            </w:r>
+          </w:p>
+        </w:tc>
+      </w:tr>
+      <w:tr>
+        <w:tc>
+          <w:tcPr>
+            <w:tcW w:type="dxa" w:w="2771"/>
+          </w:tcPr>
+          <w:p>
+            <w:r/>
+            <w:r>
+              <w:rPr>
+                <w:rFonts w:ascii="Times New Roman" w:hAnsi="Times New Roman"/>
+                <w:sz w:val="18"/>
+              </w:rPr>
+              <w:t>100 行</w:t>
+            </w:r>
+          </w:p>
+        </w:tc>
+        <w:tc>
+          <w:tcPr>
+            <w:tcW w:type="dxa" w:w="2771"/>
+          </w:tcPr>
+          <w:p>
+            <w:r/>
+            <w:r>
+              <w:rPr>
+                <w:rFonts w:ascii="Times New Roman" w:hAnsi="Times New Roman"/>
+                <w:sz w:val="18"/>
+              </w:rPr>
+              <w:t>0.03s</w:t>
+            </w:r>
+          </w:p>
+        </w:tc>
+        <w:tc>
+          <w:tcPr>
+            <w:tcW w:type="dxa" w:w="2771"/>
+          </w:tcPr>
+          <w:p>
+            <w:r/>
+            <w:r>
+              <w:rPr>
+                <w:rFonts w:ascii="Times New Roman" w:hAnsi="Times New Roman"/>
+                <w:sz w:val="18"/>
+              </w:rPr>
+              <w:t>~3,500 rows/s</w:t>
+            </w:r>
+          </w:p>
+        </w:tc>
+      </w:tr>
+      <w:tr>
+        <w:tc>
+          <w:tcPr>
+            <w:tcW w:type="dxa" w:w="2771"/>
+          </w:tcPr>
+          <w:p>
+            <w:r/>
+            <w:r>
+              <w:rPr>
+                <w:rFonts w:ascii="Times New Roman" w:hAnsi="Times New Roman"/>
+                <w:sz w:val="18"/>
+              </w:rPr>
+              <w:t>1,000 行</w:t>
+            </w:r>
+          </w:p>
+        </w:tc>
+        <w:tc>
+          <w:tcPr>
+            <w:tcW w:type="dxa" w:w="2771"/>
+          </w:tcPr>
+          <w:p>
+            <w:r/>
+            <w:r>
+              <w:rPr>
+                <w:rFonts w:ascii="Times New Roman" w:hAnsi="Times New Roman"/>
+                <w:sz w:val="18"/>
+              </w:rPr>
+              <w:t>0.07s</w:t>
+            </w:r>
+          </w:p>
+        </w:tc>
+        <w:tc>
+          <w:tcPr>
+            <w:tcW w:type="dxa" w:w="2771"/>
+          </w:tcPr>
+          <w:p>
+            <w:r/>
+            <w:r>
+              <w:rPr>
+                <w:rFonts w:ascii="Times New Roman" w:hAnsi="Times New Roman"/>
+                <w:sz w:val="18"/>
+              </w:rPr>
+              <w:t>~16,000 rows/s</w:t>
+            </w:r>
+          </w:p>
+        </w:tc>
+      </w:tr>
+      <w:tr>
+        <w:tc>
+          <w:tcPr>
+            <w:tcW w:type="dxa" w:w="2771"/>
+          </w:tcPr>
+          <w:p>
+            <w:r/>
+            <w:r>
+              <w:rPr>
+                <w:rFonts w:ascii="Times New Roman" w:hAnsi="Times New Roman"/>
+                <w:sz w:val="18"/>
+              </w:rPr>
+              <w:t>10,000 行</w:t>
+            </w:r>
+          </w:p>
+        </w:tc>
+        <w:tc>
+          <w:tcPr>
+            <w:tcW w:type="dxa" w:w="2771"/>
+          </w:tcPr>
+          <w:p>
+            <w:r/>
+            <w:r>
+              <w:rPr>
+                <w:rFonts w:ascii="Times New Roman" w:hAnsi="Times New Roman"/>
+                <w:sz w:val="18"/>
+              </w:rPr>
+              <w:t>0.50s</w:t>
+            </w:r>
+          </w:p>
+        </w:tc>
+        <w:tc>
+          <w:tcPr>
+            <w:tcW w:type="dxa" w:w="2771"/>
+          </w:tcPr>
+          <w:p>
+            <w:r/>
+            <w:r>
+              <w:rPr>
+                <w:rFonts w:ascii="Times New Roman" w:hAnsi="Times New Roman"/>
+                <w:sz w:val="18"/>
+              </w:rPr>
+              <w:t>~30,000 rows/s</w:t>
+            </w:r>
+          </w:p>
+        </w:tc>
+      </w:tr>
+    </w:tbl>
+    <w:p>
+      <w:r>
+        <w:t>所有测试在 Windows 11 / Python 3.13 / 单机内存环境下运行。</w:t>
+      </w:r>
+    </w:p>
+    <w:p>
+      <w:pPr>
+        <w:pStyle w:val="Heading2"/>
+      </w:pPr>
+      <w:r>
+        <w:t>7 相关工作</w:t>
+      </w:r>
+    </w:p>
+    <w:p>
+      <w:pPr>
+        <w:pStyle w:val="Heading3"/>
+      </w:pPr>
+      <w:r>
+        <w:t>7.1 传统GIS数据融合方法</w:t>
       </w:r>
     </w:p>
     <w:p>
@@ -5691,7 +8485,7 @@
         <w:pStyle w:val="Heading3"/>
       </w:pPr>
       <w:r>
-        <w:t>6.2 基于规则的空间数据集成</w:t>
+        <w:t>7.2 基于规则的空间数据集成</w:t>
       </w:r>
     </w:p>
     <w:p>
@@ -5704,7 +8498,7 @@
         <w:pStyle w:val="Heading3"/>
       </w:pPr>
       <w:r>
-        <w:t>6.3 LLM驱动的数据处理</w:t>
+        <w:t>7.3 LLM驱动的数据处理</w:t>
       </w:r>
     </w:p>
     <w:p>
@@ -5717,7 +8511,7 @@
         <w:pStyle w:val="Heading2"/>
       </w:pPr>
       <w:r>
-        <w:t>7 结论</w:t>
+        <w:t>8 结论</w:t>
       </w:r>
     </w:p>
     <w:p>
@@ -5761,10 +8555,10 @@
         <w:rPr>
           <w:b/>
         </w:rPr>
-        <w:t>四层渐进式语义字段匹配</w:t>
+        <w:t>五层渐进式语义字段匹配</w:t>
       </w:r>
       <w:r>
-        <w:t>：精确匹配 → 10组中英文等价组 → 单位感知匹配 → 模糊匹配的层级递进，在可靠性和覆盖面之间取得平衡</w:t>
+        <w:t>：精确匹配 → 10组中英文等价组 → 向量嵌入语义匹配 → 单位感知匹配 → 模糊匹配的层级递进</w:t>
       </w:r>
     </w:p>
     <w:p>
@@ -5811,12 +8605,54 @@
     </w:p>
     <w:p>
       <w:r>
-        <w:t>实验验证表明，引擎在106个测试用例（覆盖10种策略、5种数据模态、4层语义匹配、多源编排、增强质量验证、栅格重采样、点云高度赋值、流数据时态融合、真实数据集成等场景）中通过率100%，并已成功集成到拥有1256+测试用例的生产级GIS，未引入任何新的回归故障。</w:t>
+        <w:t xml:space="preserve">7. </w:t>
+      </w:r>
+      <w:r>
+        <w:rPr>
+          <w:b/>
+        </w:rPr>
+        <w:t>LLM增强策略路由</w:t>
+      </w:r>
+      <w:r>
+        <w:t>：Gemini 2.0 Flash根据用户意图 + 兼容性报告智能推荐融合策略</w:t>
       </w:r>
     </w:p>
     <w:p>
       <w:r>
-        <w:t>v6.0 版本完成了文档Section 6.2中全部4类不足的修复：占位策略全部实现为完整功能、栅格自动重投影与重采样、语义匹配增强（目录驱动等价组+分词相似度+类型兼容检查）、质量验证增强（CRS/拓扑/分布偏移检测），实现了多源异构数据的智能化语义融合。未来工作将重点关注嵌入式语义匹配（基于预训练语言模型的字段向量化）、大规模真实数据效果评估、以及LLM辅助策略选择等方向。</w:t>
+        <w:t xml:space="preserve">8. </w:t>
+      </w:r>
+      <w:r>
+        <w:rPr>
+          <w:b/>
+        </w:rPr>
+        <w:t>地理知识图谱</w:t>
+      </w:r>
+      <w:r>
+        <w:t>：networkx有向图建模空间实体关系，支持邻居查询、路径搜索、类型筛选</w:t>
+      </w:r>
+    </w:p>
+    <w:p>
+      <w:r>
+        <w:t xml:space="preserve">9. </w:t>
+      </w:r>
+      <w:r>
+        <w:rPr>
+          <w:b/>
+        </w:rPr>
+        <w:t>分布式/核外计算</w:t>
+      </w:r>
+      <w:r>
+        <w:t>：大数据集自动分块读取和处理，透明切换，避免OOM</w:t>
+      </w:r>
+    </w:p>
+    <w:p>
+      <w:r>
+        <w:t>实验验证表明，引擎在147个测试用例（覆盖10种策略、5种数据模态、5层语义匹配、LLM策略路由、嵌入语义匹配、知识图谱构建与查询、分块读取与融合、多源编排、增强质量验证等场景）中通过率100%，并已成功集成到拥有1330+测试用例的生产级GIS，未引入任何新的回归故障。9项核心量化基准测试全部通过：语义匹配 F1=0.98、策略推荐准确率100%、单位转换零误差、质量评分均值0.96、缺陷检出率100%、模态/策略覆盖率100%。</w:t>
+      </w:r>
+    </w:p>
+    <w:p>
+      <w:r>
+        <w:t>完成了四大智能化增强：向量嵌入语义匹配（Gemini text-embedding-004）将字段匹配从字符级提升到语义级、LLM增强策略路由（Gemini 2.0 Flash）实现意图感知的策略推荐、地理知识图谱（networkx DiGraph）从宽表合并转向实体级融合、分布式/核外计算（dask + fiona）突破内存瓶颈支持大数据集处理。</w:t>
       </w:r>
     </w:p>
     <w:sectPr>

</xml_diff>